<commit_message>
fixed HW and kept working on leetcode problem. Currently there's some issue somewhere about summing the numbers or whatev so...
</commit_message>
<xml_diff>
--- a/Attendance/Attendance_9-21-26/Attendance_9-21-26.docx
+++ b/Attendance/Attendance_9-21-26/Attendance_9-21-26.docx
@@ -2,7 +2,269 @@
 <file path=word/document.xml><?xml version="1.0" encoding="utf-8"?>
 <w:document xmlns:wpc="http://schemas.microsoft.com/office/word/2010/wordprocessingCanvas" xmlns:cx="http://schemas.microsoft.com/office/drawing/2014/chartex" xmlns:cx1="http://schemas.microsoft.com/office/drawing/2015/9/8/chartex" xmlns:cx2="http://schemas.microsoft.com/office/drawing/2015/10/21/chartex" xmlns:cx3="http://schemas.microsoft.com/office/drawing/2016/5/9/chartex" xmlns:cx4="http://schemas.microsoft.com/office/drawing/2016/5/10/chartex" xmlns:cx5="http://schemas.microsoft.com/office/drawing/2016/5/11/chartex" xmlns:cx6="http://schemas.microsoft.com/office/drawing/2016/5/12/chartex" xmlns:cx7="http://schemas.microsoft.com/office/drawing/2016/5/13/chartex" xmlns:cx8="http://schemas.microsoft.com/office/drawing/2016/5/14/chartex" xmlns:mc="http://schemas.openxmlformats.org/markup-compatibility/2006" xmlns:aink="http://schemas.microsoft.com/office/drawing/2016/ink" xmlns:am3d="http://schemas.microsoft.com/office/drawing/2017/model3d" xmlns:o="urn:schemas-microsoft-com:office:office" xmlns:oel="http://schemas.microsoft.com/office/2019/extlst" xmlns:r="http://schemas.openxmlformats.org/officeDocument/2006/relationships" xmlns:m="http://schemas.openxmlformats.org/officeDocument/2006/math" xmlns:v="urn:schemas-microsoft-com:vml" xmlns:wp14="http://schemas.microsoft.com/office/word/2010/wordprocessingDrawing" xmlns:wp="http://schemas.openxmlformats.org/drawingml/2006/wordprocessingDrawing" xmlns:w10="urn:schemas-microsoft-com:office:word" xmlns:w="http://schemas.openxmlformats.org/wordprocessingml/2006/main" xmlns:w14="http://schemas.microsoft.com/office/word/2010/wordml" xmlns:w15="http://schemas.microsoft.com/office/word/2012/wordml" xmlns:w16cex="http://schemas.microsoft.com/office/word/2018/wordml/cex" xmlns:w16cid="http://schemas.microsoft.com/office/word/2016/wordml/cid" xmlns:w16="http://schemas.microsoft.com/office/word/2018/wordml" xmlns:w16du="http://schemas.microsoft.com/office/word/2023/wordml/word16du" xmlns:w16sdtdh="http://schemas.microsoft.com/office/word/2020/wordml/sdtdatahash" xmlns:w16sdtfl="http://schemas.microsoft.com/office/word/2024/wordml/sdtformatlock" xmlns:w16se="http://schemas.microsoft.com/office/word/2015/wordml/symex" xmlns:wpg="http://schemas.microsoft.com/office/word/2010/wordprocessingGroup" xmlns:wpi="http://schemas.microsoft.com/office/word/2010/wordprocessingInk" xmlns:wne="http://schemas.microsoft.com/office/word/2006/wordml" xmlns:wps="http://schemas.microsoft.com/office/word/2010/wordprocessingShape" mc:Ignorable="w14 w15 w16se w16cid w16 w16cex w16sdtdh w16sdtfl w16du wp14">
   <w:body>
+    <w:p>
+      <w:proofErr w:type="gramStart"/>
+      <w:r>
+        <w:t>#include</w:t>
+      </w:r>
+      <w:proofErr w:type="gramEnd"/>
+      <w:r>
+        <w:t xml:space="preserve"> &lt;</w:t>
+      </w:r>
+      <w:proofErr w:type="spellStart"/>
+      <w:r>
+        <w:t>stdio.h</w:t>
+      </w:r>
+      <w:proofErr w:type="spellEnd"/>
+      <w:r>
+        <w:t>&gt;</w:t>
+      </w:r>
+      <w:r>
+        <w:br/>
+      </w:r>
+      <w:r>
+        <w:br/>
+      </w:r>
+      <w:r>
+        <w:br/>
+        <w:t xml:space="preserve">int </w:t>
+      </w:r>
+      <w:proofErr w:type="gramStart"/>
+      <w:r>
+        <w:t>main(</w:t>
+      </w:r>
+      <w:proofErr w:type="gramEnd"/>
+      <w:r>
+        <w:t>) {</w:t>
+      </w:r>
+      <w:r>
+        <w:br/>
+        <w:t xml:space="preserve">    </w:t>
+      </w:r>
+      <w:proofErr w:type="spellStart"/>
+      <w:proofErr w:type="gramStart"/>
+      <w:r>
+        <w:t>printf</w:t>
+      </w:r>
+      <w:proofErr w:type="spellEnd"/>
+      <w:r>
+        <w:t>(</w:t>
+      </w:r>
+      <w:proofErr w:type="gramEnd"/>
+      <w:r>
+        <w:t>"Enter a number: ");</w:t>
+      </w:r>
+      <w:r>
+        <w:br/>
+      </w:r>
+      <w:r>
+        <w:br/>
+        <w:t xml:space="preserve">    int num;</w:t>
+      </w:r>
+      <w:r>
+        <w:br/>
+        <w:t xml:space="preserve">    int sum = 1;</w:t>
+      </w:r>
+      <w:r>
+        <w:br/>
+        <w:t xml:space="preserve">    </w:t>
+      </w:r>
+      <w:proofErr w:type="spellStart"/>
+      <w:proofErr w:type="gramStart"/>
+      <w:r>
+        <w:t>scanf</w:t>
+      </w:r>
+      <w:proofErr w:type="spellEnd"/>
+      <w:r>
+        <w:t>(</w:t>
+      </w:r>
+      <w:proofErr w:type="gramEnd"/>
+      <w:r>
+        <w:t>"%d", &amp;num);</w:t>
+      </w:r>
+      <w:r>
+        <w:br/>
+      </w:r>
+      <w:r>
+        <w:br/>
+        <w:t xml:space="preserve">    </w:t>
+      </w:r>
+      <w:proofErr w:type="spellStart"/>
+      <w:proofErr w:type="gramStart"/>
+      <w:r>
+        <w:t>printf</w:t>
+      </w:r>
+      <w:proofErr w:type="spellEnd"/>
+      <w:r>
+        <w:t>(</w:t>
+      </w:r>
+      <w:proofErr w:type="gramEnd"/>
+      <w:r>
+        <w:t>"\</w:t>
+      </w:r>
+      <w:proofErr w:type="spellStart"/>
+      <w:r>
+        <w:t>n%d</w:t>
+      </w:r>
+      <w:proofErr w:type="spellEnd"/>
+      <w:r>
+        <w:t>! = 1", num);</w:t>
+      </w:r>
+      <w:r>
+        <w:br/>
+        <w:t xml:space="preserve">    for (int </w:t>
+      </w:r>
+      <w:proofErr w:type="spellStart"/>
+      <w:r>
+        <w:t>i</w:t>
+      </w:r>
+      <w:proofErr w:type="spellEnd"/>
+      <w:r>
+        <w:t xml:space="preserve"> = 2; </w:t>
+      </w:r>
+      <w:proofErr w:type="spellStart"/>
+      <w:r>
+        <w:t>i</w:t>
+      </w:r>
+      <w:proofErr w:type="spellEnd"/>
+      <w:r>
+        <w:t xml:space="preserve"> &lt;= num; </w:t>
+      </w:r>
+      <w:proofErr w:type="spellStart"/>
+      <w:r>
+        <w:t>i</w:t>
+      </w:r>
+      <w:proofErr w:type="spellEnd"/>
+      <w:r>
+        <w:t>++) {</w:t>
+      </w:r>
+      <w:r>
+        <w:br/>
+        <w:t xml:space="preserve">        </w:t>
+      </w:r>
+      <w:proofErr w:type="spellStart"/>
+      <w:proofErr w:type="gramStart"/>
+      <w:r>
+        <w:t>printf</w:t>
+      </w:r>
+      <w:proofErr w:type="spellEnd"/>
+      <w:r>
+        <w:t>(</w:t>
+      </w:r>
+      <w:proofErr w:type="gramEnd"/>
+      <w:r>
+        <w:t xml:space="preserve">" * %d", </w:t>
+      </w:r>
+      <w:proofErr w:type="spellStart"/>
+      <w:r>
+        <w:t>i</w:t>
+      </w:r>
+      <w:proofErr w:type="spellEnd"/>
+      <w:r>
+        <w:t>);</w:t>
+      </w:r>
+      <w:r>
+        <w:br/>
+        <w:t xml:space="preserve">        sum *= </w:t>
+      </w:r>
+      <w:proofErr w:type="spellStart"/>
+      <w:r>
+        <w:t>i</w:t>
+      </w:r>
+      <w:proofErr w:type="spellEnd"/>
+      <w:r>
+        <w:t>;</w:t>
+      </w:r>
+      <w:r>
+        <w:br/>
+        <w:t xml:space="preserve">  </w:t>
+      </w:r>
+      <w:proofErr w:type="gramStart"/>
+      <w:r>
+        <w:t xml:space="preserve">  }</w:t>
+      </w:r>
+      <w:proofErr w:type="gramEnd"/>
+      <w:r>
+        <w:br/>
+        <w:t xml:space="preserve">    </w:t>
+      </w:r>
+      <w:proofErr w:type="spellStart"/>
+      <w:proofErr w:type="gramStart"/>
+      <w:r>
+        <w:t>printf</w:t>
+      </w:r>
+      <w:proofErr w:type="spellEnd"/>
+      <w:r>
+        <w:t>(</w:t>
+      </w:r>
+      <w:proofErr w:type="gramEnd"/>
+      <w:r>
+        <w:t>" = %d", sum);</w:t>
+      </w:r>
+      <w:r>
+        <w:br/>
+      </w:r>
+      <w:r>
+        <w:br/>
+        <w:t>}</w:t>
+      </w:r>
+    </w:p>
     <w:p/>
+    <w:p>
+      <w:r>
+        <w:rPr>
+          <w:noProof/>
+        </w:rPr>
+        <w:drawing>
+          <wp:inline distT="0" distB="0" distL="0" distR="0" wp14:anchorId="41C13D69" wp14:editId="0B8B4BE1">
+            <wp:extent cx="5943600" cy="2295525"/>
+            <wp:effectExtent l="0" t="0" r="0" b="9525"/>
+            <wp:docPr id="2011155864" name="Picture 1"/>
+            <wp:cNvGraphicFramePr>
+              <a:graphicFrameLocks xmlns:a="http://schemas.openxmlformats.org/drawingml/2006/main" noChangeAspect="1"/>
+            </wp:cNvGraphicFramePr>
+            <a:graphic xmlns:a="http://schemas.openxmlformats.org/drawingml/2006/main">
+              <a:graphicData uri="http://schemas.openxmlformats.org/drawingml/2006/picture">
+                <pic:pic xmlns:pic="http://schemas.openxmlformats.org/drawingml/2006/picture">
+                  <pic:nvPicPr>
+                    <pic:cNvPr id="0" name="Picture 1"/>
+                    <pic:cNvPicPr>
+                      <a:picLocks noChangeAspect="1" noChangeArrowheads="1"/>
+                    </pic:cNvPicPr>
+                  </pic:nvPicPr>
+                  <pic:blipFill>
+                    <a:blip r:embed="rId5">
+                      <a:extLst>
+                        <a:ext uri="{28A0092B-C50C-407E-A947-70E740481C1C}">
+                          <a14:useLocalDpi xmlns:a14="http://schemas.microsoft.com/office/drawing/2010/main" val="0"/>
+                        </a:ext>
+                      </a:extLst>
+                    </a:blip>
+                    <a:srcRect/>
+                    <a:stretch>
+                      <a:fillRect/>
+                    </a:stretch>
+                  </pic:blipFill>
+                  <pic:spPr bwMode="auto">
+                    <a:xfrm>
+                      <a:off x="0" y="0"/>
+                      <a:ext cx="5943600" cy="2295525"/>
+                    </a:xfrm>
+                    <a:prstGeom prst="rect">
+                      <a:avLst/>
+                    </a:prstGeom>
+                    <a:noFill/>
+                    <a:ln>
+                      <a:noFill/>
+                    </a:ln>
+                  </pic:spPr>
+                </pic:pic>
+              </a:graphicData>
+            </a:graphic>
+          </wp:inline>
+        </w:drawing>
+      </w:r>
+    </w:p>
     <w:sectPr>
       <w:pgSz w:w="12240" w:h="15840"/>
       <w:pgMar w:top="1440" w:right="1440" w:bottom="1440" w:left="1440" w:header="720" w:footer="720" w:gutter="0"/>
@@ -713,7 +975,6 @@
   <w:style w:type="character" w:default="1" w:styleId="DefaultParagraphFont">
     <w:name w:val="Default Paragraph Font"/>
     <w:uiPriority w:val="1"/>
-    <w:semiHidden/>
     <w:unhideWhenUsed/>
   </w:style>
   <w:style w:type="table" w:default="1" w:styleId="TableNormal">

</xml_diff>